<commit_message>
test: regenerate baselines for the v8 PDF/generator changes; fix calendar assertion
Regenerate the parser and generator baselines to capture the v8 output that was
verified per-fix but never re-baselined: PDF text color extracted by default, the
recovered calendar table with de-stacked cell text, and the DOCX/ODT generator
and vMerge/header-row parser fixes from the review pass. Also correct the new PDF
smoke assertion to inspect individual calendar cells rather than the table's
space-joined text (where adjacent cells "11" "12" read as "11 12" and tripped the
"1 1" split check).

Full suite green: parser 677, generator 1715, sanitization 372, CLI 62, license
and shipping-artifact checks all pass.
</commit_message>
<xml_diff>
--- a/test/generator/baseline/gen.csv.to.docx.docx
+++ b/test/generator/baseline/gen.csv.to.docx.docx
@@ -24,13 +24,19 @@
         </w:tblBorders>
       </w:tblPr>
       <w:tblGrid>
-        <w:gridCol w:w="1289"/>
-        <w:gridCol w:w="1289"/>
-        <w:gridCol w:w="1289"/>
-        <w:gridCol w:w="1289"/>
-        <w:gridCol w:w="1289"/>
-        <w:gridCol w:w="1289"/>
-        <w:gridCol w:w="1289"/>
+        <w:gridCol w:w="694"/>
+        <w:gridCol w:w="694"/>
+        <w:gridCol w:w="694"/>
+        <w:gridCol w:w="694"/>
+        <w:gridCol w:w="694"/>
+        <w:gridCol w:w="694"/>
+        <w:gridCol w:w="694"/>
+        <w:gridCol w:w="694"/>
+        <w:gridCol w:w="694"/>
+        <w:gridCol w:w="694"/>
+        <w:gridCol w:w="694"/>
+        <w:gridCol w:w="694"/>
+        <w:gridCol w:w="694"/>
       </w:tblGrid>
       <w:tr>
         <w:tc>
@@ -81,6 +87,326 @@
           <w:tcPr>
             <w:tcW w:w="0" w:type="auto"/>
           </w:tcPr>
+          <w:p/>
+        </w:tc>
+        <w:tc>
+          <w:tcPr>
+            <w:tcW w:w="0" w:type="auto"/>
+          </w:tcPr>
+          <w:p/>
+        </w:tc>
+        <w:tc>
+          <w:tcPr>
+            <w:tcW w:w="0" w:type="auto"/>
+          </w:tcPr>
+          <w:p/>
+        </w:tc>
+        <w:tc>
+          <w:tcPr>
+            <w:tcW w:w="0" w:type="auto"/>
+          </w:tcPr>
+          <w:p/>
+        </w:tc>
+        <w:tc>
+          <w:tcPr>
+            <w:tcW w:w="0" w:type="auto"/>
+          </w:tcPr>
+          <w:p/>
+        </w:tc>
+        <w:tc>
+          <w:tcPr>
+            <w:tcW w:w="0" w:type="auto"/>
+          </w:tcPr>
+          <w:p/>
+        </w:tc>
+        <w:tc>
+          <w:tcPr>
+            <w:tcW w:w="0" w:type="auto"/>
+          </w:tcPr>
+          <w:p/>
+        </w:tc>
+        <w:tc>
+          <w:tcPr>
+            <w:tcW w:w="0" w:type="auto"/>
+          </w:tcPr>
+          <w:p/>
+        </w:tc>
+        <w:tc>
+          <w:tcPr>
+            <w:tcW w:w="0" w:type="auto"/>
+          </w:tcPr>
+          <w:p/>
+        </w:tc>
+        <w:tc>
+          <w:tcPr>
+            <w:tcW w:w="0" w:type="auto"/>
+          </w:tcPr>
+          <w:p/>
+        </w:tc>
+        <w:tc>
+          <w:tcPr>
+            <w:tcW w:w="0" w:type="auto"/>
+          </w:tcPr>
+          <w:p/>
+        </w:tc>
+        <w:tc>
+          <w:tcPr>
+            <w:tcW w:w="0" w:type="auto"/>
+          </w:tcPr>
+          <w:p/>
+        </w:tc>
+        <w:tc>
+          <w:tcPr>
+            <w:tcW w:w="0" w:type="auto"/>
+          </w:tcPr>
+          <w:p/>
+        </w:tc>
+      </w:tr>
+      <w:tr>
+        <w:tc>
+          <w:tcPr>
+            <w:tcW w:w="0" w:type="auto"/>
+          </w:tcPr>
+          <w:p/>
+        </w:tc>
+        <w:tc>
+          <w:tcPr>
+            <w:tcW w:w="0" w:type="auto"/>
+          </w:tcPr>
+          <w:p/>
+        </w:tc>
+        <w:tc>
+          <w:tcPr>
+            <w:tcW w:w="0" w:type="auto"/>
+          </w:tcPr>
+          <w:p/>
+        </w:tc>
+        <w:tc>
+          <w:tcPr>
+            <w:tcW w:w="0" w:type="auto"/>
+          </w:tcPr>
+          <w:p/>
+        </w:tc>
+        <w:tc>
+          <w:tcPr>
+            <w:tcW w:w="0" w:type="auto"/>
+          </w:tcPr>
+          <w:p/>
+        </w:tc>
+        <w:tc>
+          <w:tcPr>
+            <w:tcW w:w="0" w:type="auto"/>
+          </w:tcPr>
+          <w:p/>
+        </w:tc>
+        <w:tc>
+          <w:tcPr>
+            <w:tcW w:w="0" w:type="auto"/>
+          </w:tcPr>
+          <w:p/>
+        </w:tc>
+        <w:tc>
+          <w:tcPr>
+            <w:tcW w:w="0" w:type="auto"/>
+          </w:tcPr>
+          <w:p/>
+        </w:tc>
+        <w:tc>
+          <w:tcPr>
+            <w:tcW w:w="0" w:type="auto"/>
+          </w:tcPr>
+          <w:p/>
+        </w:tc>
+        <w:tc>
+          <w:tcPr>
+            <w:tcW w:w="0" w:type="auto"/>
+          </w:tcPr>
+          <w:p/>
+        </w:tc>
+        <w:tc>
+          <w:tcPr>
+            <w:tcW w:w="0" w:type="auto"/>
+          </w:tcPr>
+          <w:p/>
+        </w:tc>
+        <w:tc>
+          <w:tcPr>
+            <w:tcW w:w="0" w:type="auto"/>
+          </w:tcPr>
+          <w:p/>
+        </w:tc>
+        <w:tc>
+          <w:tcPr>
+            <w:tcW w:w="0" w:type="auto"/>
+          </w:tcPr>
+          <w:p/>
+        </w:tc>
+      </w:tr>
+      <w:tr>
+        <w:tc>
+          <w:tcPr>
+            <w:tcW w:w="0" w:type="auto"/>
+          </w:tcPr>
+          <w:p/>
+        </w:tc>
+        <w:tc>
+          <w:tcPr>
+            <w:tcW w:w="0" w:type="auto"/>
+          </w:tcPr>
+          <w:p/>
+        </w:tc>
+        <w:tc>
+          <w:tcPr>
+            <w:tcW w:w="0" w:type="auto"/>
+          </w:tcPr>
+          <w:p/>
+        </w:tc>
+        <w:tc>
+          <w:tcPr>
+            <w:tcW w:w="0" w:type="auto"/>
+          </w:tcPr>
+          <w:p/>
+        </w:tc>
+        <w:tc>
+          <w:tcPr>
+            <w:tcW w:w="0" w:type="auto"/>
+          </w:tcPr>
+          <w:p/>
+        </w:tc>
+        <w:tc>
+          <w:tcPr>
+            <w:tcW w:w="0" w:type="auto"/>
+          </w:tcPr>
+          <w:p/>
+        </w:tc>
+        <w:tc>
+          <w:tcPr>
+            <w:tcW w:w="0" w:type="auto"/>
+          </w:tcPr>
+          <w:p/>
+        </w:tc>
+        <w:tc>
+          <w:tcPr>
+            <w:tcW w:w="0" w:type="auto"/>
+          </w:tcPr>
+          <w:p/>
+        </w:tc>
+        <w:tc>
+          <w:tcPr>
+            <w:tcW w:w="0" w:type="auto"/>
+          </w:tcPr>
+          <w:p/>
+        </w:tc>
+        <w:tc>
+          <w:tcPr>
+            <w:tcW w:w="0" w:type="auto"/>
+          </w:tcPr>
+          <w:p/>
+        </w:tc>
+        <w:tc>
+          <w:tcPr>
+            <w:tcW w:w="0" w:type="auto"/>
+          </w:tcPr>
+          <w:p/>
+        </w:tc>
+        <w:tc>
+          <w:tcPr>
+            <w:tcW w:w="0" w:type="auto"/>
+          </w:tcPr>
+          <w:p/>
+        </w:tc>
+        <w:tc>
+          <w:tcPr>
+            <w:tcW w:w="0" w:type="auto"/>
+          </w:tcPr>
+          <w:p/>
+        </w:tc>
+      </w:tr>
+      <w:tr>
+        <w:tc>
+          <w:tcPr>
+            <w:tcW w:w="0" w:type="auto"/>
+          </w:tcPr>
+          <w:p/>
+        </w:tc>
+        <w:tc>
+          <w:tcPr>
+            <w:tcW w:w="0" w:type="auto"/>
+          </w:tcPr>
+          <w:p/>
+        </w:tc>
+        <w:tc>
+          <w:tcPr>
+            <w:tcW w:w="0" w:type="auto"/>
+          </w:tcPr>
+          <w:p/>
+        </w:tc>
+        <w:tc>
+          <w:tcPr>
+            <w:tcW w:w="0" w:type="auto"/>
+          </w:tcPr>
+          <w:p/>
+        </w:tc>
+        <w:tc>
+          <w:tcPr>
+            <w:tcW w:w="0" w:type="auto"/>
+          </w:tcPr>
+          <w:p/>
+        </w:tc>
+        <w:tc>
+          <w:tcPr>
+            <w:tcW w:w="0" w:type="auto"/>
+          </w:tcPr>
+          <w:p/>
+        </w:tc>
+        <w:tc>
+          <w:tcPr>
+            <w:tcW w:w="0" w:type="auto"/>
+          </w:tcPr>
+          <w:p/>
+        </w:tc>
+        <w:tc>
+          <w:tcPr>
+            <w:tcW w:w="0" w:type="auto"/>
+          </w:tcPr>
+          <w:p/>
+        </w:tc>
+        <w:tc>
+          <w:tcPr>
+            <w:tcW w:w="0" w:type="auto"/>
+          </w:tcPr>
+          <w:p/>
+        </w:tc>
+        <w:tc>
+          <w:tcPr>
+            <w:tcW w:w="0" w:type="auto"/>
+          </w:tcPr>
+          <w:p/>
+        </w:tc>
+        <w:tc>
+          <w:tcPr>
+            <w:tcW w:w="0" w:type="auto"/>
+          </w:tcPr>
+          <w:p/>
+        </w:tc>
+        <w:tc>
+          <w:tcPr>
+            <w:tcW w:w="0" w:type="auto"/>
+          </w:tcPr>
+          <w:p/>
+        </w:tc>
+        <w:tc>
+          <w:tcPr>
+            <w:tcW w:w="0" w:type="auto"/>
+          </w:tcPr>
+          <w:p/>
+        </w:tc>
+      </w:tr>
+      <w:tr>
+        <w:tc>
+          <w:tcPr>
+            <w:tcW w:w="0" w:type="auto"/>
+          </w:tcPr>
           <w:p>
             <w:r>
               <w:t xml:space="preserve">Demonstration of DOCX support in calibre </w:t>
@@ -266,6 +592,166 @@
               <w:t xml:space="preserve">Four </w:t>
             </w:r>
           </w:p>
+        </w:tc>
+      </w:tr>
+      <w:tr>
+        <w:tc>
+          <w:tcPr>
+            <w:tcW w:w="0" w:type="auto"/>
+          </w:tcPr>
+          <w:p/>
+        </w:tc>
+        <w:tc>
+          <w:tcPr>
+            <w:tcW w:w="0" w:type="auto"/>
+          </w:tcPr>
+          <w:p/>
+        </w:tc>
+        <w:tc>
+          <w:tcPr>
+            <w:tcW w:w="0" w:type="auto"/>
+          </w:tcPr>
+          <w:p/>
+        </w:tc>
+        <w:tc>
+          <w:tcPr>
+            <w:tcW w:w="0" w:type="auto"/>
+          </w:tcPr>
+          <w:p/>
+        </w:tc>
+        <w:tc>
+          <w:tcPr>
+            <w:tcW w:w="0" w:type="auto"/>
+          </w:tcPr>
+          <w:p/>
+        </w:tc>
+        <w:tc>
+          <w:tcPr>
+            <w:tcW w:w="0" w:type="auto"/>
+          </w:tcPr>
+          <w:p/>
+        </w:tc>
+        <w:tc>
+          <w:tcPr>
+            <w:tcW w:w="0" w:type="auto"/>
+          </w:tcPr>
+          <w:p/>
+        </w:tc>
+        <w:tc>
+          <w:tcPr>
+            <w:tcW w:w="0" w:type="auto"/>
+          </w:tcPr>
+          <w:p/>
+        </w:tc>
+        <w:tc>
+          <w:tcPr>
+            <w:tcW w:w="0" w:type="auto"/>
+          </w:tcPr>
+          <w:p/>
+        </w:tc>
+        <w:tc>
+          <w:tcPr>
+            <w:tcW w:w="0" w:type="auto"/>
+          </w:tcPr>
+          <w:p/>
+        </w:tc>
+        <w:tc>
+          <w:tcPr>
+            <w:tcW w:w="0" w:type="auto"/>
+          </w:tcPr>
+          <w:p/>
+        </w:tc>
+        <w:tc>
+          <w:tcPr>
+            <w:tcW w:w="0" w:type="auto"/>
+          </w:tcPr>
+          <w:p/>
+        </w:tc>
+        <w:tc>
+          <w:tcPr>
+            <w:tcW w:w="0" w:type="auto"/>
+          </w:tcPr>
+          <w:p/>
+        </w:tc>
+      </w:tr>
+      <w:tr>
+        <w:tc>
+          <w:tcPr>
+            <w:tcW w:w="0" w:type="auto"/>
+          </w:tcPr>
+          <w:p/>
+        </w:tc>
+        <w:tc>
+          <w:tcPr>
+            <w:tcW w:w="0" w:type="auto"/>
+          </w:tcPr>
+          <w:p/>
+        </w:tc>
+        <w:tc>
+          <w:tcPr>
+            <w:tcW w:w="0" w:type="auto"/>
+          </w:tcPr>
+          <w:p/>
+        </w:tc>
+        <w:tc>
+          <w:tcPr>
+            <w:tcW w:w="0" w:type="auto"/>
+          </w:tcPr>
+          <w:p/>
+        </w:tc>
+        <w:tc>
+          <w:tcPr>
+            <w:tcW w:w="0" w:type="auto"/>
+          </w:tcPr>
+          <w:p/>
+        </w:tc>
+        <w:tc>
+          <w:tcPr>
+            <w:tcW w:w="0" w:type="auto"/>
+          </w:tcPr>
+          <w:p/>
+        </w:tc>
+        <w:tc>
+          <w:tcPr>
+            <w:tcW w:w="0" w:type="auto"/>
+          </w:tcPr>
+          <w:p/>
+        </w:tc>
+        <w:tc>
+          <w:tcPr>
+            <w:tcW w:w="0" w:type="auto"/>
+          </w:tcPr>
+          <w:p/>
+        </w:tc>
+        <w:tc>
+          <w:tcPr>
+            <w:tcW w:w="0" w:type="auto"/>
+          </w:tcPr>
+          <w:p/>
+        </w:tc>
+        <w:tc>
+          <w:tcPr>
+            <w:tcW w:w="0" w:type="auto"/>
+          </w:tcPr>
+          <w:p/>
+        </w:tc>
+        <w:tc>
+          <w:tcPr>
+            <w:tcW w:w="0" w:type="auto"/>
+          </w:tcPr>
+          <w:p/>
+        </w:tc>
+        <w:tc>
+          <w:tcPr>
+            <w:tcW w:w="0" w:type="auto"/>
+          </w:tcPr>
+          <w:p/>
+        </w:tc>
+        <w:tc>
+          <w:tcPr>
+            <w:tcW w:w="0" w:type="auto"/>
+          </w:tcPr>
+          <w:p/>
         </w:tc>
       </w:tr>
       <w:tr>
@@ -419,6 +905,166 @@
           <w:tcPr>
             <w:tcW w:w="0" w:type="auto"/>
           </w:tcPr>
+          <w:p/>
+        </w:tc>
+        <w:tc>
+          <w:tcPr>
+            <w:tcW w:w="0" w:type="auto"/>
+          </w:tcPr>
+          <w:p/>
+        </w:tc>
+        <w:tc>
+          <w:tcPr>
+            <w:tcW w:w="0" w:type="auto"/>
+          </w:tcPr>
+          <w:p/>
+        </w:tc>
+        <w:tc>
+          <w:tcPr>
+            <w:tcW w:w="0" w:type="auto"/>
+          </w:tcPr>
+          <w:p/>
+        </w:tc>
+        <w:tc>
+          <w:tcPr>
+            <w:tcW w:w="0" w:type="auto"/>
+          </w:tcPr>
+          <w:p/>
+        </w:tc>
+        <w:tc>
+          <w:tcPr>
+            <w:tcW w:w="0" w:type="auto"/>
+          </w:tcPr>
+          <w:p/>
+        </w:tc>
+        <w:tc>
+          <w:tcPr>
+            <w:tcW w:w="0" w:type="auto"/>
+          </w:tcPr>
+          <w:p/>
+        </w:tc>
+        <w:tc>
+          <w:tcPr>
+            <w:tcW w:w="0" w:type="auto"/>
+          </w:tcPr>
+          <w:p/>
+        </w:tc>
+        <w:tc>
+          <w:tcPr>
+            <w:tcW w:w="0" w:type="auto"/>
+          </w:tcPr>
+          <w:p/>
+        </w:tc>
+        <w:tc>
+          <w:tcPr>
+            <w:tcW w:w="0" w:type="auto"/>
+          </w:tcPr>
+          <w:p/>
+        </w:tc>
+        <w:tc>
+          <w:tcPr>
+            <w:tcW w:w="0" w:type="auto"/>
+          </w:tcPr>
+          <w:p/>
+        </w:tc>
+        <w:tc>
+          <w:tcPr>
+            <w:tcW w:w="0" w:type="auto"/>
+          </w:tcPr>
+          <w:p/>
+        </w:tc>
+        <w:tc>
+          <w:tcPr>
+            <w:tcW w:w="0" w:type="auto"/>
+          </w:tcPr>
+          <w:p/>
+        </w:tc>
+      </w:tr>
+      <w:tr>
+        <w:tc>
+          <w:tcPr>
+            <w:tcW w:w="0" w:type="auto"/>
+          </w:tcPr>
+          <w:p/>
+        </w:tc>
+        <w:tc>
+          <w:tcPr>
+            <w:tcW w:w="0" w:type="auto"/>
+          </w:tcPr>
+          <w:p/>
+        </w:tc>
+        <w:tc>
+          <w:tcPr>
+            <w:tcW w:w="0" w:type="auto"/>
+          </w:tcPr>
+          <w:p/>
+        </w:tc>
+        <w:tc>
+          <w:tcPr>
+            <w:tcW w:w="0" w:type="auto"/>
+          </w:tcPr>
+          <w:p/>
+        </w:tc>
+        <w:tc>
+          <w:tcPr>
+            <w:tcW w:w="0" w:type="auto"/>
+          </w:tcPr>
+          <w:p/>
+        </w:tc>
+        <w:tc>
+          <w:tcPr>
+            <w:tcW w:w="0" w:type="auto"/>
+          </w:tcPr>
+          <w:p/>
+        </w:tc>
+        <w:tc>
+          <w:tcPr>
+            <w:tcW w:w="0" w:type="auto"/>
+          </w:tcPr>
+          <w:p/>
+        </w:tc>
+        <w:tc>
+          <w:tcPr>
+            <w:tcW w:w="0" w:type="auto"/>
+          </w:tcPr>
+          <w:p/>
+        </w:tc>
+        <w:tc>
+          <w:tcPr>
+            <w:tcW w:w="0" w:type="auto"/>
+          </w:tcPr>
+          <w:p/>
+        </w:tc>
+        <w:tc>
+          <w:tcPr>
+            <w:tcW w:w="0" w:type="auto"/>
+          </w:tcPr>
+          <w:p/>
+        </w:tc>
+        <w:tc>
+          <w:tcPr>
+            <w:tcW w:w="0" w:type="auto"/>
+          </w:tcPr>
+          <w:p/>
+        </w:tc>
+        <w:tc>
+          <w:tcPr>
+            <w:tcW w:w="0" w:type="auto"/>
+          </w:tcPr>
+          <w:p/>
+        </w:tc>
+        <w:tc>
+          <w:tcPr>
+            <w:tcW w:w="0" w:type="auto"/>
+          </w:tcPr>
+          <w:p/>
+        </w:tc>
+      </w:tr>
+      <w:tr>
+        <w:tc>
+          <w:tcPr>
+            <w:tcW w:w="0" w:type="auto"/>
+          </w:tcPr>
           <w:p>
             <w:r>
               <w:t xml:space="preserve">Tables </w:t>
@@ -859,6 +1505,166 @@
           <w:tcPr>
             <w:tcW w:w="0" w:type="auto"/>
           </w:tcPr>
+          <w:p/>
+        </w:tc>
+        <w:tc>
+          <w:tcPr>
+            <w:tcW w:w="0" w:type="auto"/>
+          </w:tcPr>
+          <w:p/>
+        </w:tc>
+        <w:tc>
+          <w:tcPr>
+            <w:tcW w:w="0" w:type="auto"/>
+          </w:tcPr>
+          <w:p/>
+        </w:tc>
+        <w:tc>
+          <w:tcPr>
+            <w:tcW w:w="0" w:type="auto"/>
+          </w:tcPr>
+          <w:p/>
+        </w:tc>
+        <w:tc>
+          <w:tcPr>
+            <w:tcW w:w="0" w:type="auto"/>
+          </w:tcPr>
+          <w:p/>
+        </w:tc>
+        <w:tc>
+          <w:tcPr>
+            <w:tcW w:w="0" w:type="auto"/>
+          </w:tcPr>
+          <w:p/>
+        </w:tc>
+        <w:tc>
+          <w:tcPr>
+            <w:tcW w:w="0" w:type="auto"/>
+          </w:tcPr>
+          <w:p/>
+        </w:tc>
+        <w:tc>
+          <w:tcPr>
+            <w:tcW w:w="0" w:type="auto"/>
+          </w:tcPr>
+          <w:p/>
+        </w:tc>
+        <w:tc>
+          <w:tcPr>
+            <w:tcW w:w="0" w:type="auto"/>
+          </w:tcPr>
+          <w:p/>
+        </w:tc>
+        <w:tc>
+          <w:tcPr>
+            <w:tcW w:w="0" w:type="auto"/>
+          </w:tcPr>
+          <w:p/>
+        </w:tc>
+        <w:tc>
+          <w:tcPr>
+            <w:tcW w:w="0" w:type="auto"/>
+          </w:tcPr>
+          <w:p/>
+        </w:tc>
+        <w:tc>
+          <w:tcPr>
+            <w:tcW w:w="0" w:type="auto"/>
+          </w:tcPr>
+          <w:p/>
+        </w:tc>
+        <w:tc>
+          <w:tcPr>
+            <w:tcW w:w="0" w:type="auto"/>
+          </w:tcPr>
+          <w:p/>
+        </w:tc>
+      </w:tr>
+      <w:tr>
+        <w:tc>
+          <w:tcPr>
+            <w:tcW w:w="0" w:type="auto"/>
+          </w:tcPr>
+          <w:p/>
+        </w:tc>
+        <w:tc>
+          <w:tcPr>
+            <w:tcW w:w="0" w:type="auto"/>
+          </w:tcPr>
+          <w:p/>
+        </w:tc>
+        <w:tc>
+          <w:tcPr>
+            <w:tcW w:w="0" w:type="auto"/>
+          </w:tcPr>
+          <w:p/>
+        </w:tc>
+        <w:tc>
+          <w:tcPr>
+            <w:tcW w:w="0" w:type="auto"/>
+          </w:tcPr>
+          <w:p/>
+        </w:tc>
+        <w:tc>
+          <w:tcPr>
+            <w:tcW w:w="0" w:type="auto"/>
+          </w:tcPr>
+          <w:p/>
+        </w:tc>
+        <w:tc>
+          <w:tcPr>
+            <w:tcW w:w="0" w:type="auto"/>
+          </w:tcPr>
+          <w:p/>
+        </w:tc>
+        <w:tc>
+          <w:tcPr>
+            <w:tcW w:w="0" w:type="auto"/>
+          </w:tcPr>
+          <w:p/>
+        </w:tc>
+        <w:tc>
+          <w:tcPr>
+            <w:tcW w:w="0" w:type="auto"/>
+          </w:tcPr>
+          <w:p/>
+        </w:tc>
+        <w:tc>
+          <w:tcPr>
+            <w:tcW w:w="0" w:type="auto"/>
+          </w:tcPr>
+          <w:p/>
+        </w:tc>
+        <w:tc>
+          <w:tcPr>
+            <w:tcW w:w="0" w:type="auto"/>
+          </w:tcPr>
+          <w:p/>
+        </w:tc>
+        <w:tc>
+          <w:tcPr>
+            <w:tcW w:w="0" w:type="auto"/>
+          </w:tcPr>
+          <w:p/>
+        </w:tc>
+        <w:tc>
+          <w:tcPr>
+            <w:tcW w:w="0" w:type="auto"/>
+          </w:tcPr>
+          <w:p/>
+        </w:tc>
+        <w:tc>
+          <w:tcPr>
+            <w:tcW w:w="0" w:type="auto"/>
+          </w:tcPr>
+          <w:p/>
+        </w:tc>
+      </w:tr>
+      <w:tr>
+        <w:tc>
+          <w:tcPr>
+            <w:tcW w:w="0" w:type="auto"/>
+          </w:tcPr>
           <w:p>
             <w:r>
               <w:t xml:space="preserve">Next, we see a table with special formatting in various locations. Notice how the formatting for the header row and sub header rows is preserved. </w:t>
@@ -913,6 +1719,12 @@
           <w:tcPr>
             <w:tcW w:w="0" w:type="auto"/>
           </w:tcPr>
+          <w:p/>
+        </w:tc>
+        <w:tc>
+          <w:tcPr>
+            <w:tcW w:w="0" w:type="auto"/>
+          </w:tcPr>
           <w:p>
             <w:r>
               <w:t xml:space="preserve">Undergraduate </w:t>
@@ -1009,6 +1821,12 @@
           <w:tcPr>
             <w:tcW w:w="0" w:type="auto"/>
           </w:tcPr>
+          <w:p/>
+        </w:tc>
+        <w:tc>
+          <w:tcPr>
+            <w:tcW w:w="0" w:type="auto"/>
+          </w:tcPr>
           <w:p>
             <w:r>
               <w:t xml:space="preserve">Graduate </w:t>
@@ -1227,6 +2045,246 @@
           <w:tcPr>
             <w:tcW w:w="0" w:type="auto"/>
           </w:tcPr>
+          <w:p/>
+        </w:tc>
+        <w:tc>
+          <w:tcPr>
+            <w:tcW w:w="0" w:type="auto"/>
+          </w:tcPr>
+          <w:p/>
+        </w:tc>
+        <w:tc>
+          <w:tcPr>
+            <w:tcW w:w="0" w:type="auto"/>
+          </w:tcPr>
+          <w:p/>
+        </w:tc>
+        <w:tc>
+          <w:tcPr>
+            <w:tcW w:w="0" w:type="auto"/>
+          </w:tcPr>
+          <w:p/>
+        </w:tc>
+        <w:tc>
+          <w:tcPr>
+            <w:tcW w:w="0" w:type="auto"/>
+          </w:tcPr>
+          <w:p/>
+        </w:tc>
+        <w:tc>
+          <w:tcPr>
+            <w:tcW w:w="0" w:type="auto"/>
+          </w:tcPr>
+          <w:p/>
+        </w:tc>
+        <w:tc>
+          <w:tcPr>
+            <w:tcW w:w="0" w:type="auto"/>
+          </w:tcPr>
+          <w:p/>
+        </w:tc>
+        <w:tc>
+          <w:tcPr>
+            <w:tcW w:w="0" w:type="auto"/>
+          </w:tcPr>
+          <w:p/>
+        </w:tc>
+        <w:tc>
+          <w:tcPr>
+            <w:tcW w:w="0" w:type="auto"/>
+          </w:tcPr>
+          <w:p/>
+        </w:tc>
+        <w:tc>
+          <w:tcPr>
+            <w:tcW w:w="0" w:type="auto"/>
+          </w:tcPr>
+          <w:p/>
+        </w:tc>
+        <w:tc>
+          <w:tcPr>
+            <w:tcW w:w="0" w:type="auto"/>
+          </w:tcPr>
+          <w:p/>
+        </w:tc>
+        <w:tc>
+          <w:tcPr>
+            <w:tcW w:w="0" w:type="auto"/>
+          </w:tcPr>
+          <w:p/>
+        </w:tc>
+        <w:tc>
+          <w:tcPr>
+            <w:tcW w:w="0" w:type="auto"/>
+          </w:tcPr>
+          <w:p/>
+        </w:tc>
+      </w:tr>
+      <w:tr>
+        <w:tc>
+          <w:tcPr>
+            <w:tcW w:w="0" w:type="auto"/>
+          </w:tcPr>
+          <w:p/>
+        </w:tc>
+        <w:tc>
+          <w:tcPr>
+            <w:tcW w:w="0" w:type="auto"/>
+          </w:tcPr>
+          <w:p/>
+        </w:tc>
+        <w:tc>
+          <w:tcPr>
+            <w:tcW w:w="0" w:type="auto"/>
+          </w:tcPr>
+          <w:p/>
+        </w:tc>
+        <w:tc>
+          <w:tcPr>
+            <w:tcW w:w="0" w:type="auto"/>
+          </w:tcPr>
+          <w:p/>
+        </w:tc>
+        <w:tc>
+          <w:tcPr>
+            <w:tcW w:w="0" w:type="auto"/>
+          </w:tcPr>
+          <w:p/>
+        </w:tc>
+        <w:tc>
+          <w:tcPr>
+            <w:tcW w:w="0" w:type="auto"/>
+          </w:tcPr>
+          <w:p/>
+        </w:tc>
+        <w:tc>
+          <w:tcPr>
+            <w:tcW w:w="0" w:type="auto"/>
+          </w:tcPr>
+          <w:p/>
+        </w:tc>
+        <w:tc>
+          <w:tcPr>
+            <w:tcW w:w="0" w:type="auto"/>
+          </w:tcPr>
+          <w:p/>
+        </w:tc>
+        <w:tc>
+          <w:tcPr>
+            <w:tcW w:w="0" w:type="auto"/>
+          </w:tcPr>
+          <w:p/>
+        </w:tc>
+        <w:tc>
+          <w:tcPr>
+            <w:tcW w:w="0" w:type="auto"/>
+          </w:tcPr>
+          <w:p/>
+        </w:tc>
+        <w:tc>
+          <w:tcPr>
+            <w:tcW w:w="0" w:type="auto"/>
+          </w:tcPr>
+          <w:p/>
+        </w:tc>
+        <w:tc>
+          <w:tcPr>
+            <w:tcW w:w="0" w:type="auto"/>
+          </w:tcPr>
+          <w:p/>
+        </w:tc>
+        <w:tc>
+          <w:tcPr>
+            <w:tcW w:w="0" w:type="auto"/>
+          </w:tcPr>
+          <w:p/>
+        </w:tc>
+      </w:tr>
+      <w:tr>
+        <w:tc>
+          <w:tcPr>
+            <w:tcW w:w="0" w:type="auto"/>
+          </w:tcPr>
+          <w:p/>
+        </w:tc>
+        <w:tc>
+          <w:tcPr>
+            <w:tcW w:w="0" w:type="auto"/>
+          </w:tcPr>
+          <w:p/>
+        </w:tc>
+        <w:tc>
+          <w:tcPr>
+            <w:tcW w:w="0" w:type="auto"/>
+          </w:tcPr>
+          <w:p/>
+        </w:tc>
+        <w:tc>
+          <w:tcPr>
+            <w:tcW w:w="0" w:type="auto"/>
+          </w:tcPr>
+          <w:p/>
+        </w:tc>
+        <w:tc>
+          <w:tcPr>
+            <w:tcW w:w="0" w:type="auto"/>
+          </w:tcPr>
+          <w:p/>
+        </w:tc>
+        <w:tc>
+          <w:tcPr>
+            <w:tcW w:w="0" w:type="auto"/>
+          </w:tcPr>
+          <w:p/>
+        </w:tc>
+        <w:tc>
+          <w:tcPr>
+            <w:tcW w:w="0" w:type="auto"/>
+          </w:tcPr>
+          <w:p/>
+        </w:tc>
+        <w:tc>
+          <w:tcPr>
+            <w:tcW w:w="0" w:type="auto"/>
+          </w:tcPr>
+          <w:p/>
+        </w:tc>
+        <w:tc>
+          <w:tcPr>
+            <w:tcW w:w="0" w:type="auto"/>
+          </w:tcPr>
+          <w:p/>
+        </w:tc>
+        <w:tc>
+          <w:tcPr>
+            <w:tcW w:w="0" w:type="auto"/>
+          </w:tcPr>
+          <w:p/>
+        </w:tc>
+        <w:tc>
+          <w:tcPr>
+            <w:tcW w:w="0" w:type="auto"/>
+          </w:tcPr>
+          <w:p/>
+        </w:tc>
+        <w:tc>
+          <w:tcPr>
+            <w:tcW w:w="0" w:type="auto"/>
+          </w:tcPr>
+          <w:p/>
+        </w:tc>
+        <w:tc>
+          <w:tcPr>
+            <w:tcW w:w="0" w:type="auto"/>
+          </w:tcPr>
+          <w:p/>
+        </w:tc>
+      </w:tr>
+      <w:tr>
+        <w:tc>
+          <w:tcPr>
+            <w:tcW w:w="0" w:type="auto"/>
+          </w:tcPr>
           <w:p>
             <w:r>
               <w:t xml:space="preserve">We end with a fancy calendar, note how much of the original formatting is preserved. Note that this table will only display correctly on relatively wide screens. In general, very wide tables or tables whose cells have fixed width requirements don’t fare well in ebooks. </w:t>
@@ -1261,6 +2319,12 @@
           <w:tcPr>
             <w:tcW w:w="0" w:type="auto"/>
           </w:tcPr>
+          <w:p/>
+        </w:tc>
+        <w:tc>
+          <w:tcPr>
+            <w:tcW w:w="0" w:type="auto"/>
+          </w:tcPr>
           <w:p>
             <w:r>
               <w:t xml:space="preserve">Mon </w:t>
@@ -1271,6 +2335,12 @@
           <w:tcPr>
             <w:tcW w:w="0" w:type="auto"/>
           </w:tcPr>
+          <w:p/>
+        </w:tc>
+        <w:tc>
+          <w:tcPr>
+            <w:tcW w:w="0" w:type="auto"/>
+          </w:tcPr>
           <w:p>
             <w:r>
               <w:t xml:space="preserve">Tue </w:t>
@@ -1281,6 +2351,12 @@
           <w:tcPr>
             <w:tcW w:w="0" w:type="auto"/>
           </w:tcPr>
+          <w:p/>
+        </w:tc>
+        <w:tc>
+          <w:tcPr>
+            <w:tcW w:w="0" w:type="auto"/>
+          </w:tcPr>
           <w:p>
             <w:r>
               <w:t xml:space="preserve">Wed </w:t>
@@ -1291,6 +2367,12 @@
           <w:tcPr>
             <w:tcW w:w="0" w:type="auto"/>
           </w:tcPr>
+          <w:p/>
+        </w:tc>
+        <w:tc>
+          <w:tcPr>
+            <w:tcW w:w="0" w:type="auto"/>
+          </w:tcPr>
           <w:p>
             <w:r>
               <w:t xml:space="preserve">Thu </w:t>
@@ -1301,6 +2383,12 @@
           <w:tcPr>
             <w:tcW w:w="0" w:type="auto"/>
           </w:tcPr>
+          <w:p/>
+        </w:tc>
+        <w:tc>
+          <w:tcPr>
+            <w:tcW w:w="0" w:type="auto"/>
+          </w:tcPr>
           <w:p>
             <w:r>
               <w:t xml:space="preserve">Fri </w:t>
@@ -1311,6 +2399,12 @@
           <w:tcPr>
             <w:tcW w:w="0" w:type="auto"/>
           </w:tcPr>
+          <w:p/>
+        </w:tc>
+        <w:tc>
+          <w:tcPr>
+            <w:tcW w:w="0" w:type="auto"/>
+          </w:tcPr>
           <w:p>
             <w:r>
               <w:t xml:space="preserve">Sat </w:t>
@@ -1323,6 +2417,78 @@
           <w:tcPr>
             <w:tcW w:w="0" w:type="auto"/>
           </w:tcPr>
+          <w:p/>
+        </w:tc>
+        <w:tc>
+          <w:tcPr>
+            <w:tcW w:w="0" w:type="auto"/>
+          </w:tcPr>
+          <w:p/>
+        </w:tc>
+        <w:tc>
+          <w:tcPr>
+            <w:tcW w:w="0" w:type="auto"/>
+          </w:tcPr>
+          <w:p/>
+        </w:tc>
+        <w:tc>
+          <w:tcPr>
+            <w:tcW w:w="0" w:type="auto"/>
+          </w:tcPr>
+          <w:p/>
+        </w:tc>
+        <w:tc>
+          <w:tcPr>
+            <w:tcW w:w="0" w:type="auto"/>
+          </w:tcPr>
+          <w:p/>
+        </w:tc>
+        <w:tc>
+          <w:tcPr>
+            <w:tcW w:w="0" w:type="auto"/>
+          </w:tcPr>
+          <w:p/>
+        </w:tc>
+        <w:tc>
+          <w:tcPr>
+            <w:tcW w:w="0" w:type="auto"/>
+          </w:tcPr>
+          <w:p/>
+        </w:tc>
+        <w:tc>
+          <w:tcPr>
+            <w:tcW w:w="0" w:type="auto"/>
+          </w:tcPr>
+          <w:p/>
+        </w:tc>
+        <w:tc>
+          <w:tcPr>
+            <w:tcW w:w="0" w:type="auto"/>
+          </w:tcPr>
+          <w:p/>
+        </w:tc>
+        <w:tc>
+          <w:tcPr>
+            <w:tcW w:w="0" w:type="auto"/>
+          </w:tcPr>
+          <w:p/>
+        </w:tc>
+        <w:tc>
+          <w:tcPr>
+            <w:tcW w:w="0" w:type="auto"/>
+          </w:tcPr>
+          <w:p/>
+        </w:tc>
+        <w:tc>
+          <w:tcPr>
+            <w:tcW w:w="0" w:type="auto"/>
+          </w:tcPr>
+          <w:p/>
+        </w:tc>
+        <w:tc>
+          <w:tcPr>
+            <w:tcW w:w="0" w:type="auto"/>
+          </w:tcPr>
           <w:p>
             <w:r>
               <w:t xml:space="preserve">1 </w:t>
@@ -1335,6 +2501,86 @@
           <w:tcPr>
             <w:tcW w:w="0" w:type="auto"/>
           </w:tcPr>
+          <w:p/>
+        </w:tc>
+        <w:tc>
+          <w:tcPr>
+            <w:tcW w:w="0" w:type="auto"/>
+          </w:tcPr>
+          <w:p/>
+        </w:tc>
+        <w:tc>
+          <w:tcPr>
+            <w:tcW w:w="0" w:type="auto"/>
+          </w:tcPr>
+          <w:p/>
+        </w:tc>
+        <w:tc>
+          <w:tcPr>
+            <w:tcW w:w="0" w:type="auto"/>
+          </w:tcPr>
+          <w:p/>
+        </w:tc>
+        <w:tc>
+          <w:tcPr>
+            <w:tcW w:w="0" w:type="auto"/>
+          </w:tcPr>
+          <w:p/>
+        </w:tc>
+        <w:tc>
+          <w:tcPr>
+            <w:tcW w:w="0" w:type="auto"/>
+          </w:tcPr>
+          <w:p/>
+        </w:tc>
+        <w:tc>
+          <w:tcPr>
+            <w:tcW w:w="0" w:type="auto"/>
+          </w:tcPr>
+          <w:p/>
+        </w:tc>
+        <w:tc>
+          <w:tcPr>
+            <w:tcW w:w="0" w:type="auto"/>
+          </w:tcPr>
+          <w:p/>
+        </w:tc>
+        <w:tc>
+          <w:tcPr>
+            <w:tcW w:w="0" w:type="auto"/>
+          </w:tcPr>
+          <w:p/>
+        </w:tc>
+        <w:tc>
+          <w:tcPr>
+            <w:tcW w:w="0" w:type="auto"/>
+          </w:tcPr>
+          <w:p/>
+        </w:tc>
+        <w:tc>
+          <w:tcPr>
+            <w:tcW w:w="0" w:type="auto"/>
+          </w:tcPr>
+          <w:p/>
+        </w:tc>
+        <w:tc>
+          <w:tcPr>
+            <w:tcW w:w="0" w:type="auto"/>
+          </w:tcPr>
+          <w:p/>
+        </w:tc>
+        <w:tc>
+          <w:tcPr>
+            <w:tcW w:w="0" w:type="auto"/>
+          </w:tcPr>
+          <w:p/>
+        </w:tc>
+      </w:tr>
+      <w:tr>
+        <w:tc>
+          <w:tcPr>
+            <w:tcW w:w="0" w:type="auto"/>
+          </w:tcPr>
           <w:p>
             <w:r>
               <w:t xml:space="preserve">2 </w:t>
@@ -1345,6 +2591,12 @@
           <w:tcPr>
             <w:tcW w:w="0" w:type="auto"/>
           </w:tcPr>
+          <w:p/>
+        </w:tc>
+        <w:tc>
+          <w:tcPr>
+            <w:tcW w:w="0" w:type="auto"/>
+          </w:tcPr>
           <w:p>
             <w:r>
               <w:t xml:space="preserve">3 </w:t>
@@ -1355,6 +2607,12 @@
           <w:tcPr>
             <w:tcW w:w="0" w:type="auto"/>
           </w:tcPr>
+          <w:p/>
+        </w:tc>
+        <w:tc>
+          <w:tcPr>
+            <w:tcW w:w="0" w:type="auto"/>
+          </w:tcPr>
           <w:p>
             <w:r>
               <w:t xml:space="preserve">4 </w:t>
@@ -1365,6 +2623,12 @@
           <w:tcPr>
             <w:tcW w:w="0" w:type="auto"/>
           </w:tcPr>
+          <w:p/>
+        </w:tc>
+        <w:tc>
+          <w:tcPr>
+            <w:tcW w:w="0" w:type="auto"/>
+          </w:tcPr>
           <w:p>
             <w:r>
               <w:t xml:space="preserve">5 </w:t>
@@ -1375,6 +2639,12 @@
           <w:tcPr>
             <w:tcW w:w="0" w:type="auto"/>
           </w:tcPr>
+          <w:p/>
+        </w:tc>
+        <w:tc>
+          <w:tcPr>
+            <w:tcW w:w="0" w:type="auto"/>
+          </w:tcPr>
           <w:p>
             <w:r>
               <w:t xml:space="preserve">6 </w:t>
@@ -1385,6 +2655,12 @@
           <w:tcPr>
             <w:tcW w:w="0" w:type="auto"/>
           </w:tcPr>
+          <w:p/>
+        </w:tc>
+        <w:tc>
+          <w:tcPr>
+            <w:tcW w:w="0" w:type="auto"/>
+          </w:tcPr>
           <w:p>
             <w:r>
               <w:t xml:space="preserve">7 </w:t>
@@ -1395,6 +2671,12 @@
           <w:tcPr>
             <w:tcW w:w="0" w:type="auto"/>
           </w:tcPr>
+          <w:p/>
+        </w:tc>
+        <w:tc>
+          <w:tcPr>
+            <w:tcW w:w="0" w:type="auto"/>
+          </w:tcPr>
           <w:p>
             <w:r>
               <w:t xml:space="preserve">8 </w:t>
@@ -1407,6 +2689,86 @@
           <w:tcPr>
             <w:tcW w:w="0" w:type="auto"/>
           </w:tcPr>
+          <w:p/>
+        </w:tc>
+        <w:tc>
+          <w:tcPr>
+            <w:tcW w:w="0" w:type="auto"/>
+          </w:tcPr>
+          <w:p/>
+        </w:tc>
+        <w:tc>
+          <w:tcPr>
+            <w:tcW w:w="0" w:type="auto"/>
+          </w:tcPr>
+          <w:p/>
+        </w:tc>
+        <w:tc>
+          <w:tcPr>
+            <w:tcW w:w="0" w:type="auto"/>
+          </w:tcPr>
+          <w:p/>
+        </w:tc>
+        <w:tc>
+          <w:tcPr>
+            <w:tcW w:w="0" w:type="auto"/>
+          </w:tcPr>
+          <w:p/>
+        </w:tc>
+        <w:tc>
+          <w:tcPr>
+            <w:tcW w:w="0" w:type="auto"/>
+          </w:tcPr>
+          <w:p/>
+        </w:tc>
+        <w:tc>
+          <w:tcPr>
+            <w:tcW w:w="0" w:type="auto"/>
+          </w:tcPr>
+          <w:p/>
+        </w:tc>
+        <w:tc>
+          <w:tcPr>
+            <w:tcW w:w="0" w:type="auto"/>
+          </w:tcPr>
+          <w:p/>
+        </w:tc>
+        <w:tc>
+          <w:tcPr>
+            <w:tcW w:w="0" w:type="auto"/>
+          </w:tcPr>
+          <w:p/>
+        </w:tc>
+        <w:tc>
+          <w:tcPr>
+            <w:tcW w:w="0" w:type="auto"/>
+          </w:tcPr>
+          <w:p/>
+        </w:tc>
+        <w:tc>
+          <w:tcPr>
+            <w:tcW w:w="0" w:type="auto"/>
+          </w:tcPr>
+          <w:p/>
+        </w:tc>
+        <w:tc>
+          <w:tcPr>
+            <w:tcW w:w="0" w:type="auto"/>
+          </w:tcPr>
+          <w:p/>
+        </w:tc>
+        <w:tc>
+          <w:tcPr>
+            <w:tcW w:w="0" w:type="auto"/>
+          </w:tcPr>
+          <w:p/>
+        </w:tc>
+      </w:tr>
+      <w:tr>
+        <w:tc>
+          <w:tcPr>
+            <w:tcW w:w="0" w:type="auto"/>
+          </w:tcPr>
           <w:p>
             <w:r>
               <w:t xml:space="preserve">9 </w:t>
@@ -1417,6 +2779,12 @@
           <w:tcPr>
             <w:tcW w:w="0" w:type="auto"/>
           </w:tcPr>
+          <w:p/>
+        </w:tc>
+        <w:tc>
+          <w:tcPr>
+            <w:tcW w:w="0" w:type="auto"/>
+          </w:tcPr>
           <w:p>
             <w:r>
               <w:t xml:space="preserve">10 </w:t>
@@ -1427,6 +2795,12 @@
           <w:tcPr>
             <w:tcW w:w="0" w:type="auto"/>
           </w:tcPr>
+          <w:p/>
+        </w:tc>
+        <w:tc>
+          <w:tcPr>
+            <w:tcW w:w="0" w:type="auto"/>
+          </w:tcPr>
           <w:p>
             <w:r>
               <w:t xml:space="preserve">11 </w:t>
@@ -1437,6 +2811,12 @@
           <w:tcPr>
             <w:tcW w:w="0" w:type="auto"/>
           </w:tcPr>
+          <w:p/>
+        </w:tc>
+        <w:tc>
+          <w:tcPr>
+            <w:tcW w:w="0" w:type="auto"/>
+          </w:tcPr>
           <w:p>
             <w:r>
               <w:t xml:space="preserve">12 </w:t>
@@ -1447,6 +2827,12 @@
           <w:tcPr>
             <w:tcW w:w="0" w:type="auto"/>
           </w:tcPr>
+          <w:p/>
+        </w:tc>
+        <w:tc>
+          <w:tcPr>
+            <w:tcW w:w="0" w:type="auto"/>
+          </w:tcPr>
           <w:p>
             <w:r>
               <w:t xml:space="preserve">13 </w:t>
@@ -1457,6 +2843,12 @@
           <w:tcPr>
             <w:tcW w:w="0" w:type="auto"/>
           </w:tcPr>
+          <w:p/>
+        </w:tc>
+        <w:tc>
+          <w:tcPr>
+            <w:tcW w:w="0" w:type="auto"/>
+          </w:tcPr>
           <w:p>
             <w:r>
               <w:t xml:space="preserve">14 </w:t>
@@ -1467,6 +2859,12 @@
           <w:tcPr>
             <w:tcW w:w="0" w:type="auto"/>
           </w:tcPr>
+          <w:p/>
+        </w:tc>
+        <w:tc>
+          <w:tcPr>
+            <w:tcW w:w="0" w:type="auto"/>
+          </w:tcPr>
           <w:p>
             <w:r>
               <w:t xml:space="preserve">15 </w:t>
@@ -1479,6 +2877,86 @@
           <w:tcPr>
             <w:tcW w:w="0" w:type="auto"/>
           </w:tcPr>
+          <w:p/>
+        </w:tc>
+        <w:tc>
+          <w:tcPr>
+            <w:tcW w:w="0" w:type="auto"/>
+          </w:tcPr>
+          <w:p/>
+        </w:tc>
+        <w:tc>
+          <w:tcPr>
+            <w:tcW w:w="0" w:type="auto"/>
+          </w:tcPr>
+          <w:p/>
+        </w:tc>
+        <w:tc>
+          <w:tcPr>
+            <w:tcW w:w="0" w:type="auto"/>
+          </w:tcPr>
+          <w:p/>
+        </w:tc>
+        <w:tc>
+          <w:tcPr>
+            <w:tcW w:w="0" w:type="auto"/>
+          </w:tcPr>
+          <w:p/>
+        </w:tc>
+        <w:tc>
+          <w:tcPr>
+            <w:tcW w:w="0" w:type="auto"/>
+          </w:tcPr>
+          <w:p/>
+        </w:tc>
+        <w:tc>
+          <w:tcPr>
+            <w:tcW w:w="0" w:type="auto"/>
+          </w:tcPr>
+          <w:p/>
+        </w:tc>
+        <w:tc>
+          <w:tcPr>
+            <w:tcW w:w="0" w:type="auto"/>
+          </w:tcPr>
+          <w:p/>
+        </w:tc>
+        <w:tc>
+          <w:tcPr>
+            <w:tcW w:w="0" w:type="auto"/>
+          </w:tcPr>
+          <w:p/>
+        </w:tc>
+        <w:tc>
+          <w:tcPr>
+            <w:tcW w:w="0" w:type="auto"/>
+          </w:tcPr>
+          <w:p/>
+        </w:tc>
+        <w:tc>
+          <w:tcPr>
+            <w:tcW w:w="0" w:type="auto"/>
+          </w:tcPr>
+          <w:p/>
+        </w:tc>
+        <w:tc>
+          <w:tcPr>
+            <w:tcW w:w="0" w:type="auto"/>
+          </w:tcPr>
+          <w:p/>
+        </w:tc>
+        <w:tc>
+          <w:tcPr>
+            <w:tcW w:w="0" w:type="auto"/>
+          </w:tcPr>
+          <w:p/>
+        </w:tc>
+      </w:tr>
+      <w:tr>
+        <w:tc>
+          <w:tcPr>
+            <w:tcW w:w="0" w:type="auto"/>
+          </w:tcPr>
           <w:p>
             <w:r>
               <w:t xml:space="preserve">16 </w:t>
@@ -1489,6 +2967,12 @@
           <w:tcPr>
             <w:tcW w:w="0" w:type="auto"/>
           </w:tcPr>
+          <w:p/>
+        </w:tc>
+        <w:tc>
+          <w:tcPr>
+            <w:tcW w:w="0" w:type="auto"/>
+          </w:tcPr>
           <w:p>
             <w:r>
               <w:t xml:space="preserve">17 </w:t>
@@ -1499,6 +2983,12 @@
           <w:tcPr>
             <w:tcW w:w="0" w:type="auto"/>
           </w:tcPr>
+          <w:p/>
+        </w:tc>
+        <w:tc>
+          <w:tcPr>
+            <w:tcW w:w="0" w:type="auto"/>
+          </w:tcPr>
           <w:p>
             <w:r>
               <w:t xml:space="preserve">18 </w:t>
@@ -1509,6 +2999,12 @@
           <w:tcPr>
             <w:tcW w:w="0" w:type="auto"/>
           </w:tcPr>
+          <w:p/>
+        </w:tc>
+        <w:tc>
+          <w:tcPr>
+            <w:tcW w:w="0" w:type="auto"/>
+          </w:tcPr>
           <w:p>
             <w:r>
               <w:t xml:space="preserve">19 </w:t>
@@ -1519,6 +3015,12 @@
           <w:tcPr>
             <w:tcW w:w="0" w:type="auto"/>
           </w:tcPr>
+          <w:p/>
+        </w:tc>
+        <w:tc>
+          <w:tcPr>
+            <w:tcW w:w="0" w:type="auto"/>
+          </w:tcPr>
           <w:p>
             <w:r>
               <w:t xml:space="preserve">20 </w:t>
@@ -1529,6 +3031,12 @@
           <w:tcPr>
             <w:tcW w:w="0" w:type="auto"/>
           </w:tcPr>
+          <w:p/>
+        </w:tc>
+        <w:tc>
+          <w:tcPr>
+            <w:tcW w:w="0" w:type="auto"/>
+          </w:tcPr>
           <w:p>
             <w:r>
               <w:t xml:space="preserve">21 </w:t>
@@ -1539,6 +3047,12 @@
           <w:tcPr>
             <w:tcW w:w="0" w:type="auto"/>
           </w:tcPr>
+          <w:p/>
+        </w:tc>
+        <w:tc>
+          <w:tcPr>
+            <w:tcW w:w="0" w:type="auto"/>
+          </w:tcPr>
           <w:p>
             <w:r>
               <w:t xml:space="preserve">22 </w:t>
@@ -1551,6 +3065,86 @@
           <w:tcPr>
             <w:tcW w:w="0" w:type="auto"/>
           </w:tcPr>
+          <w:p/>
+        </w:tc>
+        <w:tc>
+          <w:tcPr>
+            <w:tcW w:w="0" w:type="auto"/>
+          </w:tcPr>
+          <w:p/>
+        </w:tc>
+        <w:tc>
+          <w:tcPr>
+            <w:tcW w:w="0" w:type="auto"/>
+          </w:tcPr>
+          <w:p/>
+        </w:tc>
+        <w:tc>
+          <w:tcPr>
+            <w:tcW w:w="0" w:type="auto"/>
+          </w:tcPr>
+          <w:p/>
+        </w:tc>
+        <w:tc>
+          <w:tcPr>
+            <w:tcW w:w="0" w:type="auto"/>
+          </w:tcPr>
+          <w:p/>
+        </w:tc>
+        <w:tc>
+          <w:tcPr>
+            <w:tcW w:w="0" w:type="auto"/>
+          </w:tcPr>
+          <w:p/>
+        </w:tc>
+        <w:tc>
+          <w:tcPr>
+            <w:tcW w:w="0" w:type="auto"/>
+          </w:tcPr>
+          <w:p/>
+        </w:tc>
+        <w:tc>
+          <w:tcPr>
+            <w:tcW w:w="0" w:type="auto"/>
+          </w:tcPr>
+          <w:p/>
+        </w:tc>
+        <w:tc>
+          <w:tcPr>
+            <w:tcW w:w="0" w:type="auto"/>
+          </w:tcPr>
+          <w:p/>
+        </w:tc>
+        <w:tc>
+          <w:tcPr>
+            <w:tcW w:w="0" w:type="auto"/>
+          </w:tcPr>
+          <w:p/>
+        </w:tc>
+        <w:tc>
+          <w:tcPr>
+            <w:tcW w:w="0" w:type="auto"/>
+          </w:tcPr>
+          <w:p/>
+        </w:tc>
+        <w:tc>
+          <w:tcPr>
+            <w:tcW w:w="0" w:type="auto"/>
+          </w:tcPr>
+          <w:p/>
+        </w:tc>
+        <w:tc>
+          <w:tcPr>
+            <w:tcW w:w="0" w:type="auto"/>
+          </w:tcPr>
+          <w:p/>
+        </w:tc>
+      </w:tr>
+      <w:tr>
+        <w:tc>
+          <w:tcPr>
+            <w:tcW w:w="0" w:type="auto"/>
+          </w:tcPr>
           <w:p>
             <w:r>
               <w:t xml:space="preserve">23 </w:t>
@@ -1561,6 +3155,12 @@
           <w:tcPr>
             <w:tcW w:w="0" w:type="auto"/>
           </w:tcPr>
+          <w:p/>
+        </w:tc>
+        <w:tc>
+          <w:tcPr>
+            <w:tcW w:w="0" w:type="auto"/>
+          </w:tcPr>
           <w:p>
             <w:r>
               <w:t xml:space="preserve">24 </w:t>
@@ -1571,6 +3171,12 @@
           <w:tcPr>
             <w:tcW w:w="0" w:type="auto"/>
           </w:tcPr>
+          <w:p/>
+        </w:tc>
+        <w:tc>
+          <w:tcPr>
+            <w:tcW w:w="0" w:type="auto"/>
+          </w:tcPr>
           <w:p>
             <w:r>
               <w:t xml:space="preserve">25 </w:t>
@@ -1581,6 +3187,12 @@
           <w:tcPr>
             <w:tcW w:w="0" w:type="auto"/>
           </w:tcPr>
+          <w:p/>
+        </w:tc>
+        <w:tc>
+          <w:tcPr>
+            <w:tcW w:w="0" w:type="auto"/>
+          </w:tcPr>
           <w:p>
             <w:r>
               <w:t xml:space="preserve">26 </w:t>
@@ -1591,6 +3203,12 @@
           <w:tcPr>
             <w:tcW w:w="0" w:type="auto"/>
           </w:tcPr>
+          <w:p/>
+        </w:tc>
+        <w:tc>
+          <w:tcPr>
+            <w:tcW w:w="0" w:type="auto"/>
+          </w:tcPr>
           <w:p>
             <w:r>
               <w:t xml:space="preserve">27 </w:t>
@@ -1601,6 +3219,12 @@
           <w:tcPr>
             <w:tcW w:w="0" w:type="auto"/>
           </w:tcPr>
+          <w:p/>
+        </w:tc>
+        <w:tc>
+          <w:tcPr>
+            <w:tcW w:w="0" w:type="auto"/>
+          </w:tcPr>
           <w:p>
             <w:r>
               <w:t xml:space="preserve">28 </w:t>
@@ -1611,6 +3235,12 @@
           <w:tcPr>
             <w:tcW w:w="0" w:type="auto"/>
           </w:tcPr>
+          <w:p/>
+        </w:tc>
+        <w:tc>
+          <w:tcPr>
+            <w:tcW w:w="0" w:type="auto"/>
+          </w:tcPr>
           <w:p>
             <w:r>
               <w:t xml:space="preserve">29 </w:t>
@@ -1623,6 +3253,86 @@
           <w:tcPr>
             <w:tcW w:w="0" w:type="auto"/>
           </w:tcPr>
+          <w:p/>
+        </w:tc>
+        <w:tc>
+          <w:tcPr>
+            <w:tcW w:w="0" w:type="auto"/>
+          </w:tcPr>
+          <w:p/>
+        </w:tc>
+        <w:tc>
+          <w:tcPr>
+            <w:tcW w:w="0" w:type="auto"/>
+          </w:tcPr>
+          <w:p/>
+        </w:tc>
+        <w:tc>
+          <w:tcPr>
+            <w:tcW w:w="0" w:type="auto"/>
+          </w:tcPr>
+          <w:p/>
+        </w:tc>
+        <w:tc>
+          <w:tcPr>
+            <w:tcW w:w="0" w:type="auto"/>
+          </w:tcPr>
+          <w:p/>
+        </w:tc>
+        <w:tc>
+          <w:tcPr>
+            <w:tcW w:w="0" w:type="auto"/>
+          </w:tcPr>
+          <w:p/>
+        </w:tc>
+        <w:tc>
+          <w:tcPr>
+            <w:tcW w:w="0" w:type="auto"/>
+          </w:tcPr>
+          <w:p/>
+        </w:tc>
+        <w:tc>
+          <w:tcPr>
+            <w:tcW w:w="0" w:type="auto"/>
+          </w:tcPr>
+          <w:p/>
+        </w:tc>
+        <w:tc>
+          <w:tcPr>
+            <w:tcW w:w="0" w:type="auto"/>
+          </w:tcPr>
+          <w:p/>
+        </w:tc>
+        <w:tc>
+          <w:tcPr>
+            <w:tcW w:w="0" w:type="auto"/>
+          </w:tcPr>
+          <w:p/>
+        </w:tc>
+        <w:tc>
+          <w:tcPr>
+            <w:tcW w:w="0" w:type="auto"/>
+          </w:tcPr>
+          <w:p/>
+        </w:tc>
+        <w:tc>
+          <w:tcPr>
+            <w:tcW w:w="0" w:type="auto"/>
+          </w:tcPr>
+          <w:p/>
+        </w:tc>
+        <w:tc>
+          <w:tcPr>
+            <w:tcW w:w="0" w:type="auto"/>
+          </w:tcPr>
+          <w:p/>
+        </w:tc>
+      </w:tr>
+      <w:tr>
+        <w:tc>
+          <w:tcPr>
+            <w:tcW w:w="0" w:type="auto"/>
+          </w:tcPr>
           <w:p>
             <w:r>
               <w:t xml:space="preserve">30 </w:t>
@@ -1633,6 +3343,12 @@
           <w:tcPr>
             <w:tcW w:w="0" w:type="auto"/>
           </w:tcPr>
+          <w:p/>
+        </w:tc>
+        <w:tc>
+          <w:tcPr>
+            <w:tcW w:w="0" w:type="auto"/>
+          </w:tcPr>
           <w:p>
             <w:r>
               <w:t xml:space="preserve">31 </w:t>
@@ -1645,6 +3361,166 @@
           <w:tcPr>
             <w:tcW w:w="0" w:type="auto"/>
           </w:tcPr>
+          <w:p/>
+        </w:tc>
+        <w:tc>
+          <w:tcPr>
+            <w:tcW w:w="0" w:type="auto"/>
+          </w:tcPr>
+          <w:p/>
+        </w:tc>
+        <w:tc>
+          <w:tcPr>
+            <w:tcW w:w="0" w:type="auto"/>
+          </w:tcPr>
+          <w:p/>
+        </w:tc>
+        <w:tc>
+          <w:tcPr>
+            <w:tcW w:w="0" w:type="auto"/>
+          </w:tcPr>
+          <w:p/>
+        </w:tc>
+        <w:tc>
+          <w:tcPr>
+            <w:tcW w:w="0" w:type="auto"/>
+          </w:tcPr>
+          <w:p/>
+        </w:tc>
+        <w:tc>
+          <w:tcPr>
+            <w:tcW w:w="0" w:type="auto"/>
+          </w:tcPr>
+          <w:p/>
+        </w:tc>
+        <w:tc>
+          <w:tcPr>
+            <w:tcW w:w="0" w:type="auto"/>
+          </w:tcPr>
+          <w:p/>
+        </w:tc>
+        <w:tc>
+          <w:tcPr>
+            <w:tcW w:w="0" w:type="auto"/>
+          </w:tcPr>
+          <w:p/>
+        </w:tc>
+        <w:tc>
+          <w:tcPr>
+            <w:tcW w:w="0" w:type="auto"/>
+          </w:tcPr>
+          <w:p/>
+        </w:tc>
+        <w:tc>
+          <w:tcPr>
+            <w:tcW w:w="0" w:type="auto"/>
+          </w:tcPr>
+          <w:p/>
+        </w:tc>
+        <w:tc>
+          <w:tcPr>
+            <w:tcW w:w="0" w:type="auto"/>
+          </w:tcPr>
+          <w:p/>
+        </w:tc>
+        <w:tc>
+          <w:tcPr>
+            <w:tcW w:w="0" w:type="auto"/>
+          </w:tcPr>
+          <w:p/>
+        </w:tc>
+        <w:tc>
+          <w:tcPr>
+            <w:tcW w:w="0" w:type="auto"/>
+          </w:tcPr>
+          <w:p/>
+        </w:tc>
+      </w:tr>
+      <w:tr>
+        <w:tc>
+          <w:tcPr>
+            <w:tcW w:w="0" w:type="auto"/>
+          </w:tcPr>
+          <w:p/>
+        </w:tc>
+        <w:tc>
+          <w:tcPr>
+            <w:tcW w:w="0" w:type="auto"/>
+          </w:tcPr>
+          <w:p/>
+        </w:tc>
+        <w:tc>
+          <w:tcPr>
+            <w:tcW w:w="0" w:type="auto"/>
+          </w:tcPr>
+          <w:p/>
+        </w:tc>
+        <w:tc>
+          <w:tcPr>
+            <w:tcW w:w="0" w:type="auto"/>
+          </w:tcPr>
+          <w:p/>
+        </w:tc>
+        <w:tc>
+          <w:tcPr>
+            <w:tcW w:w="0" w:type="auto"/>
+          </w:tcPr>
+          <w:p/>
+        </w:tc>
+        <w:tc>
+          <w:tcPr>
+            <w:tcW w:w="0" w:type="auto"/>
+          </w:tcPr>
+          <w:p/>
+        </w:tc>
+        <w:tc>
+          <w:tcPr>
+            <w:tcW w:w="0" w:type="auto"/>
+          </w:tcPr>
+          <w:p/>
+        </w:tc>
+        <w:tc>
+          <w:tcPr>
+            <w:tcW w:w="0" w:type="auto"/>
+          </w:tcPr>
+          <w:p/>
+        </w:tc>
+        <w:tc>
+          <w:tcPr>
+            <w:tcW w:w="0" w:type="auto"/>
+          </w:tcPr>
+          <w:p/>
+        </w:tc>
+        <w:tc>
+          <w:tcPr>
+            <w:tcW w:w="0" w:type="auto"/>
+          </w:tcPr>
+          <w:p/>
+        </w:tc>
+        <w:tc>
+          <w:tcPr>
+            <w:tcW w:w="0" w:type="auto"/>
+          </w:tcPr>
+          <w:p/>
+        </w:tc>
+        <w:tc>
+          <w:tcPr>
+            <w:tcW w:w="0" w:type="auto"/>
+          </w:tcPr>
+          <w:p/>
+        </w:tc>
+        <w:tc>
+          <w:tcPr>
+            <w:tcW w:w="0" w:type="auto"/>
+          </w:tcPr>
+          <w:p/>
+        </w:tc>
+      </w:tr>
+      <w:tr>
+        <w:tc>
+          <w:tcPr>
+            <w:tcW w:w="0" w:type="auto"/>
+          </w:tcPr>
           <w:p>
             <w:r>
               <w:t xml:space="preserve">Structural Elements </w:t>
@@ -1753,6 +3629,166 @@
           <w:tcPr>
             <w:tcW w:w="0" w:type="auto"/>
           </w:tcPr>
+          <w:p/>
+        </w:tc>
+        <w:tc>
+          <w:tcPr>
+            <w:tcW w:w="0" w:type="auto"/>
+          </w:tcPr>
+          <w:p/>
+        </w:tc>
+        <w:tc>
+          <w:tcPr>
+            <w:tcW w:w="0" w:type="auto"/>
+          </w:tcPr>
+          <w:p/>
+        </w:tc>
+        <w:tc>
+          <w:tcPr>
+            <w:tcW w:w="0" w:type="auto"/>
+          </w:tcPr>
+          <w:p/>
+        </w:tc>
+        <w:tc>
+          <w:tcPr>
+            <w:tcW w:w="0" w:type="auto"/>
+          </w:tcPr>
+          <w:p/>
+        </w:tc>
+        <w:tc>
+          <w:tcPr>
+            <w:tcW w:w="0" w:type="auto"/>
+          </w:tcPr>
+          <w:p/>
+        </w:tc>
+        <w:tc>
+          <w:tcPr>
+            <w:tcW w:w="0" w:type="auto"/>
+          </w:tcPr>
+          <w:p/>
+        </w:tc>
+        <w:tc>
+          <w:tcPr>
+            <w:tcW w:w="0" w:type="auto"/>
+          </w:tcPr>
+          <w:p/>
+        </w:tc>
+        <w:tc>
+          <w:tcPr>
+            <w:tcW w:w="0" w:type="auto"/>
+          </w:tcPr>
+          <w:p/>
+        </w:tc>
+        <w:tc>
+          <w:tcPr>
+            <w:tcW w:w="0" w:type="auto"/>
+          </w:tcPr>
+          <w:p/>
+        </w:tc>
+        <w:tc>
+          <w:tcPr>
+            <w:tcW w:w="0" w:type="auto"/>
+          </w:tcPr>
+          <w:p/>
+        </w:tc>
+        <w:tc>
+          <w:tcPr>
+            <w:tcW w:w="0" w:type="auto"/>
+          </w:tcPr>
+          <w:p/>
+        </w:tc>
+        <w:tc>
+          <w:tcPr>
+            <w:tcW w:w="0" w:type="auto"/>
+          </w:tcPr>
+          <w:p/>
+        </w:tc>
+      </w:tr>
+      <w:tr>
+        <w:tc>
+          <w:tcPr>
+            <w:tcW w:w="0" w:type="auto"/>
+          </w:tcPr>
+          <w:p/>
+        </w:tc>
+        <w:tc>
+          <w:tcPr>
+            <w:tcW w:w="0" w:type="auto"/>
+          </w:tcPr>
+          <w:p/>
+        </w:tc>
+        <w:tc>
+          <w:tcPr>
+            <w:tcW w:w="0" w:type="auto"/>
+          </w:tcPr>
+          <w:p/>
+        </w:tc>
+        <w:tc>
+          <w:tcPr>
+            <w:tcW w:w="0" w:type="auto"/>
+          </w:tcPr>
+          <w:p/>
+        </w:tc>
+        <w:tc>
+          <w:tcPr>
+            <w:tcW w:w="0" w:type="auto"/>
+          </w:tcPr>
+          <w:p/>
+        </w:tc>
+        <w:tc>
+          <w:tcPr>
+            <w:tcW w:w="0" w:type="auto"/>
+          </w:tcPr>
+          <w:p/>
+        </w:tc>
+        <w:tc>
+          <w:tcPr>
+            <w:tcW w:w="0" w:type="auto"/>
+          </w:tcPr>
+          <w:p/>
+        </w:tc>
+        <w:tc>
+          <w:tcPr>
+            <w:tcW w:w="0" w:type="auto"/>
+          </w:tcPr>
+          <w:p/>
+        </w:tc>
+        <w:tc>
+          <w:tcPr>
+            <w:tcW w:w="0" w:type="auto"/>
+          </w:tcPr>
+          <w:p/>
+        </w:tc>
+        <w:tc>
+          <w:tcPr>
+            <w:tcW w:w="0" w:type="auto"/>
+          </w:tcPr>
+          <w:p/>
+        </w:tc>
+        <w:tc>
+          <w:tcPr>
+            <w:tcW w:w="0" w:type="auto"/>
+          </w:tcPr>
+          <w:p/>
+        </w:tc>
+        <w:tc>
+          <w:tcPr>
+            <w:tcW w:w="0" w:type="auto"/>
+          </w:tcPr>
+          <w:p/>
+        </w:tc>
+        <w:tc>
+          <w:tcPr>
+            <w:tcW w:w="0" w:type="auto"/>
+          </w:tcPr>
+          <w:p/>
+        </w:tc>
+      </w:tr>
+      <w:tr>
+        <w:tc>
+          <w:tcPr>
+            <w:tcW w:w="0" w:type="auto"/>
+          </w:tcPr>
           <w:p>
             <w:r>
               <w:t xml:space="preserve">Images </w:t>
@@ -1789,6 +3825,166 @@
           <w:tcPr>
             <w:tcW w:w="0" w:type="auto"/>
           </w:tcPr>
+          <w:p/>
+        </w:tc>
+        <w:tc>
+          <w:tcPr>
+            <w:tcW w:w="0" w:type="auto"/>
+          </w:tcPr>
+          <w:p/>
+        </w:tc>
+        <w:tc>
+          <w:tcPr>
+            <w:tcW w:w="0" w:type="auto"/>
+          </w:tcPr>
+          <w:p/>
+        </w:tc>
+        <w:tc>
+          <w:tcPr>
+            <w:tcW w:w="0" w:type="auto"/>
+          </w:tcPr>
+          <w:p/>
+        </w:tc>
+        <w:tc>
+          <w:tcPr>
+            <w:tcW w:w="0" w:type="auto"/>
+          </w:tcPr>
+          <w:p/>
+        </w:tc>
+        <w:tc>
+          <w:tcPr>
+            <w:tcW w:w="0" w:type="auto"/>
+          </w:tcPr>
+          <w:p/>
+        </w:tc>
+        <w:tc>
+          <w:tcPr>
+            <w:tcW w:w="0" w:type="auto"/>
+          </w:tcPr>
+          <w:p/>
+        </w:tc>
+        <w:tc>
+          <w:tcPr>
+            <w:tcW w:w="0" w:type="auto"/>
+          </w:tcPr>
+          <w:p/>
+        </w:tc>
+        <w:tc>
+          <w:tcPr>
+            <w:tcW w:w="0" w:type="auto"/>
+          </w:tcPr>
+          <w:p/>
+        </w:tc>
+        <w:tc>
+          <w:tcPr>
+            <w:tcW w:w="0" w:type="auto"/>
+          </w:tcPr>
+          <w:p/>
+        </w:tc>
+        <w:tc>
+          <w:tcPr>
+            <w:tcW w:w="0" w:type="auto"/>
+          </w:tcPr>
+          <w:p/>
+        </w:tc>
+        <w:tc>
+          <w:tcPr>
+            <w:tcW w:w="0" w:type="auto"/>
+          </w:tcPr>
+          <w:p/>
+        </w:tc>
+        <w:tc>
+          <w:tcPr>
+            <w:tcW w:w="0" w:type="auto"/>
+          </w:tcPr>
+          <w:p/>
+        </w:tc>
+      </w:tr>
+      <w:tr>
+        <w:tc>
+          <w:tcPr>
+            <w:tcW w:w="0" w:type="auto"/>
+          </w:tcPr>
+          <w:p/>
+        </w:tc>
+        <w:tc>
+          <w:tcPr>
+            <w:tcW w:w="0" w:type="auto"/>
+          </w:tcPr>
+          <w:p/>
+        </w:tc>
+        <w:tc>
+          <w:tcPr>
+            <w:tcW w:w="0" w:type="auto"/>
+          </w:tcPr>
+          <w:p/>
+        </w:tc>
+        <w:tc>
+          <w:tcPr>
+            <w:tcW w:w="0" w:type="auto"/>
+          </w:tcPr>
+          <w:p/>
+        </w:tc>
+        <w:tc>
+          <w:tcPr>
+            <w:tcW w:w="0" w:type="auto"/>
+          </w:tcPr>
+          <w:p/>
+        </w:tc>
+        <w:tc>
+          <w:tcPr>
+            <w:tcW w:w="0" w:type="auto"/>
+          </w:tcPr>
+          <w:p/>
+        </w:tc>
+        <w:tc>
+          <w:tcPr>
+            <w:tcW w:w="0" w:type="auto"/>
+          </w:tcPr>
+          <w:p/>
+        </w:tc>
+        <w:tc>
+          <w:tcPr>
+            <w:tcW w:w="0" w:type="auto"/>
+          </w:tcPr>
+          <w:p/>
+        </w:tc>
+        <w:tc>
+          <w:tcPr>
+            <w:tcW w:w="0" w:type="auto"/>
+          </w:tcPr>
+          <w:p/>
+        </w:tc>
+        <w:tc>
+          <w:tcPr>
+            <w:tcW w:w="0" w:type="auto"/>
+          </w:tcPr>
+          <w:p/>
+        </w:tc>
+        <w:tc>
+          <w:tcPr>
+            <w:tcW w:w="0" w:type="auto"/>
+          </w:tcPr>
+          <w:p/>
+        </w:tc>
+        <w:tc>
+          <w:tcPr>
+            <w:tcW w:w="0" w:type="auto"/>
+          </w:tcPr>
+          <w:p/>
+        </w:tc>
+        <w:tc>
+          <w:tcPr>
+            <w:tcW w:w="0" w:type="auto"/>
+          </w:tcPr>
+          <w:p/>
+        </w:tc>
+      </w:tr>
+      <w:tr>
+        <w:tc>
+          <w:tcPr>
+            <w:tcW w:w="0" w:type="auto"/>
+          </w:tcPr>
           <w:p>
             <w:r>
               <w:t xml:space="preserve">Lists </w:t>
@@ -2233,6 +4429,166 @@
           <w:tcPr>
             <w:tcW w:w="0" w:type="auto"/>
           </w:tcPr>
+          <w:p/>
+        </w:tc>
+        <w:tc>
+          <w:tcPr>
+            <w:tcW w:w="0" w:type="auto"/>
+          </w:tcPr>
+          <w:p/>
+        </w:tc>
+        <w:tc>
+          <w:tcPr>
+            <w:tcW w:w="0" w:type="auto"/>
+          </w:tcPr>
+          <w:p/>
+        </w:tc>
+        <w:tc>
+          <w:tcPr>
+            <w:tcW w:w="0" w:type="auto"/>
+          </w:tcPr>
+          <w:p/>
+        </w:tc>
+        <w:tc>
+          <w:tcPr>
+            <w:tcW w:w="0" w:type="auto"/>
+          </w:tcPr>
+          <w:p/>
+        </w:tc>
+        <w:tc>
+          <w:tcPr>
+            <w:tcW w:w="0" w:type="auto"/>
+          </w:tcPr>
+          <w:p/>
+        </w:tc>
+        <w:tc>
+          <w:tcPr>
+            <w:tcW w:w="0" w:type="auto"/>
+          </w:tcPr>
+          <w:p/>
+        </w:tc>
+        <w:tc>
+          <w:tcPr>
+            <w:tcW w:w="0" w:type="auto"/>
+          </w:tcPr>
+          <w:p/>
+        </w:tc>
+        <w:tc>
+          <w:tcPr>
+            <w:tcW w:w="0" w:type="auto"/>
+          </w:tcPr>
+          <w:p/>
+        </w:tc>
+        <w:tc>
+          <w:tcPr>
+            <w:tcW w:w="0" w:type="auto"/>
+          </w:tcPr>
+          <w:p/>
+        </w:tc>
+        <w:tc>
+          <w:tcPr>
+            <w:tcW w:w="0" w:type="auto"/>
+          </w:tcPr>
+          <w:p/>
+        </w:tc>
+        <w:tc>
+          <w:tcPr>
+            <w:tcW w:w="0" w:type="auto"/>
+          </w:tcPr>
+          <w:p/>
+        </w:tc>
+        <w:tc>
+          <w:tcPr>
+            <w:tcW w:w="0" w:type="auto"/>
+          </w:tcPr>
+          <w:p/>
+        </w:tc>
+      </w:tr>
+      <w:tr>
+        <w:tc>
+          <w:tcPr>
+            <w:tcW w:w="0" w:type="auto"/>
+          </w:tcPr>
+          <w:p/>
+        </w:tc>
+        <w:tc>
+          <w:tcPr>
+            <w:tcW w:w="0" w:type="auto"/>
+          </w:tcPr>
+          <w:p/>
+        </w:tc>
+        <w:tc>
+          <w:tcPr>
+            <w:tcW w:w="0" w:type="auto"/>
+          </w:tcPr>
+          <w:p/>
+        </w:tc>
+        <w:tc>
+          <w:tcPr>
+            <w:tcW w:w="0" w:type="auto"/>
+          </w:tcPr>
+          <w:p/>
+        </w:tc>
+        <w:tc>
+          <w:tcPr>
+            <w:tcW w:w="0" w:type="auto"/>
+          </w:tcPr>
+          <w:p/>
+        </w:tc>
+        <w:tc>
+          <w:tcPr>
+            <w:tcW w:w="0" w:type="auto"/>
+          </w:tcPr>
+          <w:p/>
+        </w:tc>
+        <w:tc>
+          <w:tcPr>
+            <w:tcW w:w="0" w:type="auto"/>
+          </w:tcPr>
+          <w:p/>
+        </w:tc>
+        <w:tc>
+          <w:tcPr>
+            <w:tcW w:w="0" w:type="auto"/>
+          </w:tcPr>
+          <w:p/>
+        </w:tc>
+        <w:tc>
+          <w:tcPr>
+            <w:tcW w:w="0" w:type="auto"/>
+          </w:tcPr>
+          <w:p/>
+        </w:tc>
+        <w:tc>
+          <w:tcPr>
+            <w:tcW w:w="0" w:type="auto"/>
+          </w:tcPr>
+          <w:p/>
+        </w:tc>
+        <w:tc>
+          <w:tcPr>
+            <w:tcW w:w="0" w:type="auto"/>
+          </w:tcPr>
+          <w:p/>
+        </w:tc>
+        <w:tc>
+          <w:tcPr>
+            <w:tcW w:w="0" w:type="auto"/>
+          </w:tcPr>
+          <w:p/>
+        </w:tc>
+        <w:tc>
+          <w:tcPr>
+            <w:tcW w:w="0" w:type="auto"/>
+          </w:tcPr>
+          <w:p/>
+        </w:tc>
+      </w:tr>
+      <w:tr>
+        <w:tc>
+          <w:tcPr>
+            <w:tcW w:w="0" w:type="auto"/>
+          </w:tcPr>
           <w:p>
             <w:r>
               <w:t xml:space="preserve">Charts</w:t>
@@ -2241,6 +4597,12 @@
         </w:tc>
       </w:tr>
       <w:tr>
+        <w:tc>
+          <w:tcPr>
+            <w:tcW w:w="0" w:type="auto"/>
+          </w:tcPr>
+          <w:p/>
+        </w:tc>
         <w:tc>
           <w:tcPr>
             <w:tcW w:w="0" w:type="auto"/>

</xml_diff>